<commit_message>
adding files for lab03
</commit_message>
<xml_diff>
--- a/labs/lab03/report/report.docx
+++ b/labs/lab03/report/report.docx
@@ -176,7 +176,7 @@
       <w:r>
         <w:drawing>
           <wp:inline>
-            <wp:extent cx="3733800" cy="344129"/>
+            <wp:extent cx="3733800" cy="2168621"/>
             <wp:effectExtent b="0" l="0" r="0" t="0"/>
             <wp:docPr descr="обновление локального репозиторого" title="" id="24" name="Picture"/>
             <a:graphic>
@@ -197,7 +197,7 @@
                   <pic:spPr bwMode="auto">
                     <a:xfrm>
                       <a:off x="0" y="0"/>
-                      <a:ext cx="3733800" cy="344129"/>
+                      <a:ext cx="3733800" cy="2168621"/>
                     </a:xfrm>
                     <a:prstGeom prst="rect">
                       <a:avLst/>
@@ -245,7 +245,7 @@
       <w:r>
         <w:drawing>
           <wp:inline>
-            <wp:extent cx="3733800" cy="327526"/>
+            <wp:extent cx="3733800" cy="2158701"/>
             <wp:effectExtent b="0" l="0" r="0" t="0"/>
             <wp:docPr descr="компиляция шаблона" title="" id="27" name="Picture"/>
             <a:graphic>
@@ -266,7 +266,7 @@
                   <pic:spPr bwMode="auto">
                     <a:xfrm>
                       <a:off x="0" y="0"/>
-                      <a:ext cx="3733800" cy="327526"/>
+                      <a:ext cx="3733800" cy="2158701"/>
                     </a:xfrm>
                     <a:prstGeom prst="rect">
                       <a:avLst/>
@@ -300,7 +300,7 @@
       <w:r>
         <w:drawing>
           <wp:inline>
-            <wp:extent cx="3733800" cy="324091"/>
+            <wp:extent cx="3733800" cy="2175426"/>
             <wp:effectExtent b="0" l="0" r="0" t="0"/>
             <wp:docPr descr="проверка" title="" id="30" name="Picture"/>
             <a:graphic>
@@ -321,7 +321,7 @@
                   <pic:spPr bwMode="auto">
                     <a:xfrm>
                       <a:off x="0" y="0"/>
-                      <a:ext cx="3733800" cy="324091"/>
+                      <a:ext cx="3733800" cy="2175426"/>
                     </a:xfrm>
                     <a:prstGeom prst="rect">
                       <a:avLst/>
@@ -369,7 +369,7 @@
       <w:r>
         <w:drawing>
           <wp:inline>
-            <wp:extent cx="3733800" cy="310533"/>
+            <wp:extent cx="3733800" cy="2169937"/>
             <wp:effectExtent b="0" l="0" r="0" t="0"/>
             <wp:docPr descr="Удаление файлов" title="" id="33" name="Picture"/>
             <a:graphic>
@@ -390,7 +390,7 @@
                   <pic:spPr bwMode="auto">
                     <a:xfrm>
                       <a:off x="0" y="0"/>
-                      <a:ext cx="3733800" cy="310533"/>
+                      <a:ext cx="3733800" cy="2169937"/>
                     </a:xfrm>
                     <a:prstGeom prst="rect">
                       <a:avLst/>
@@ -438,7 +438,7 @@
       <w:r>
         <w:drawing>
           <wp:inline>
-            <wp:extent cx="3733800" cy="334597"/>
+            <wp:extent cx="3733800" cy="1600200"/>
             <wp:effectExtent b="0" l="0" r="0" t="0"/>
             <wp:docPr descr="файл report.md" title="" id="36" name="Picture"/>
             <a:graphic>
@@ -459,7 +459,7 @@
                   <pic:spPr bwMode="auto">
                     <a:xfrm>
                       <a:off x="0" y="0"/>
-                      <a:ext cx="3733800" cy="334597"/>
+                      <a:ext cx="3733800" cy="1600200"/>
                     </a:xfrm>
                     <a:prstGeom prst="rect">
                       <a:avLst/>
@@ -517,7 +517,7 @@
       <w:r>
         <w:drawing>
           <wp:inline>
-            <wp:extent cx="3733800" cy="1923029"/>
+            <wp:extent cx="3733800" cy="2899185"/>
             <wp:effectExtent b="0" l="0" r="0" t="0"/>
             <wp:docPr descr="отчёт по лабораторной работе №2" title="" id="40" name="Picture"/>
             <a:graphic>
@@ -538,7 +538,7 @@
                   <pic:spPr bwMode="auto">
                     <a:xfrm>
                       <a:off x="0" y="0"/>
-                      <a:ext cx="3733800" cy="1923029"/>
+                      <a:ext cx="3733800" cy="2899185"/>
                     </a:xfrm>
                     <a:prstGeom prst="rect">
                       <a:avLst/>

</xml_diff>